<commit_message>
inclusão da aula de 09/03
</commit_message>
<xml_diff>
--- a/professor.lincoln/sistemas-distribuidos/Plano de Ensino - Sistemas Distribuídos.docx
+++ b/professor.lincoln/sistemas-distribuidos/Plano de Ensino - Sistemas Distribuídos.docx
@@ -628,7 +628,6 @@
           <w:r>
             <w:t xml:space="preserve"> Compostas pelo desenvolvimento das avaliações (A1, A2 e A3), roteiros de configuração de ambientes (Docker/Cloud) e leitura da bibliografia básica (</w:t>
           </w:r>
-          <w:proofErr w:type="spellStart"/>
           <w:r>
             <w:rPr>
               <w:b/>
@@ -636,7 +635,6 @@
             </w:rPr>
             <w:t>Tanenbaum</w:t>
           </w:r>
-          <w:proofErr w:type="spellEnd"/>
           <w:r>
             <w:t xml:space="preserve"> e </w:t>
           </w:r>
@@ -2102,15 +2100,7 @@
                   <w:cnfStyle w:val="000000100000" w:firstRow="0" w:lastRow="0" w:firstColumn="0" w:lastColumn="0" w:oddVBand="0" w:evenVBand="0" w:oddHBand="1" w:evenHBand="0" w:firstRowFirstColumn="0" w:firstRowLastColumn="0" w:lastRowFirstColumn="0" w:lastRowLastColumn="0"/>
                 </w:pPr>
                 <w:r>
-                  <w:t>Mensageria e Comunicação (</w:t>
-                </w:r>
-                <w:proofErr w:type="spellStart"/>
-                <w:r>
-                  <w:t>RabbitMQ</w:t>
-                </w:r>
-                <w:proofErr w:type="spellEnd"/>
-                <w:r>
-                  <w:t>/Kafka)</w:t>
+                  <w:t>Mensageria e Comunicação (RabbitMQ/Kafka)</w:t>
                 </w:r>
               </w:p>
             </w:tc>
@@ -3046,40 +3036,22 @@
           <w:r>
             <w:t xml:space="preserve"> </w:t>
           </w:r>
-          <w:proofErr w:type="spellStart"/>
           <w:r>
             <w:rPr>
               <w:b/>
               <w:bCs/>
             </w:rPr>
-            <w:t>Coulouris</w:t>
-          </w:r>
-          <w:proofErr w:type="spellEnd"/>
+            <w:t>Coulouris et al. (2013)</w:t>
+          </w:r>
+          <w:r>
+            <w:t xml:space="preserve"> e </w:t>
+          </w:r>
           <w:r>
             <w:rPr>
               <w:b/>
               <w:bCs/>
             </w:rPr>
-            <w:t xml:space="preserve"> et al. (2013)</w:t>
-          </w:r>
-          <w:r>
-            <w:t xml:space="preserve"> e </w:t>
-          </w:r>
-          <w:proofErr w:type="spellStart"/>
-          <w:r>
-            <w:rPr>
-              <w:b/>
-              <w:bCs/>
-            </w:rPr>
-            <w:t>Tanenbaum</w:t>
-          </w:r>
-          <w:proofErr w:type="spellEnd"/>
-          <w:r>
-            <w:rPr>
-              <w:b/>
-              <w:bCs/>
-            </w:rPr>
-            <w:t xml:space="preserve"> &amp; Steen (2007)</w:t>
+            <w:t>Tanenbaum &amp; Steen (2007)</w:t>
           </w:r>
           <w:r>
             <w:t xml:space="preserve"> para fundamentos.</w:t>
@@ -3130,21 +3102,12 @@
           <w:r>
             <w:t xml:space="preserve"> </w:t>
           </w:r>
-          <w:proofErr w:type="spellStart"/>
           <w:r>
             <w:rPr>
               <w:b/>
               <w:bCs/>
             </w:rPr>
-            <w:t>Forouzan</w:t>
-          </w:r>
-          <w:proofErr w:type="spellEnd"/>
-          <w:r>
-            <w:rPr>
-              <w:b/>
-              <w:bCs/>
-            </w:rPr>
-            <w:t xml:space="preserve"> (2010)</w:t>
+            <w:t>Forouzan (2010)</w:t>
           </w:r>
           <w:r>
             <w:t xml:space="preserve"> para protocolos TCP/IP e </w:t>
@@ -5122,6 +5085,7 @@
   <w:style w:type="character" w:default="1" w:styleId="Fontepargpadro">
     <w:name w:val="Default Paragraph Font"/>
     <w:uiPriority w:val="1"/>
+    <w:semiHidden/>
     <w:unhideWhenUsed/>
   </w:style>
   <w:style w:type="table" w:default="1" w:styleId="Tabelanormal">
@@ -5773,8 +5737,10 @@
     <w:rsid w:val="001F042A"/>
     <w:rsid w:val="004A7215"/>
     <w:rsid w:val="00532A11"/>
+    <w:rsid w:val="00615735"/>
     <w:rsid w:val="00621533"/>
     <w:rsid w:val="00800A8F"/>
+    <w:rsid w:val="00AD0456"/>
     <w:rsid w:val="00D7524D"/>
     <w:rsid w:val="00E041A2"/>
     <w:rsid w:val="00FE3F61"/>

</xml_diff>